<commit_message>
fix(tienda-en): revisión final del Gastro Pro Prompts eBook — afirmaciones veraces, cheat sheet, maqueta y nombres
Via: Claude Code
Co-Authored-By: Claude Opus 5.5 <noreply@anthropic.com>
</commit_message>
<xml_diff>
--- a/astro-site/public/dl/ai-prompts-for-restaurants/bonus-1-prompt-engineering-guide.docx
+++ b/astro-site/public/dl/ai-prompts-for-restaurants/bonus-1-prompt-engineering-guide.docx
@@ -80,7 +80,7 @@
           <w:sz w:val="20"/>
           <w:szCs w:val="20"/>
         </w:rPr>
-        <w:t xml:space="preserve">Included with your Pro Prompts eBook · aichef.pro</w:t>
+        <w:t xml:space="preserve">Included with your Gastro Pro Prompts eBook · aichef.pro</w:t>
       </w:r>
     </w:p>
     <w:p>
@@ -124,7 +124,7 @@
           <w:sz w:val="22"/>
           <w:szCs w:val="22"/>
         </w:rPr>
-        <w:t xml:space="preserve">80% of professionals who use AI in their food business don't get results because their prompts are too vague. "Give me ideas for my menu" or "help me with marketing" produce generic answers that are no use to anyone.</w:t>
+        <w:t xml:space="preserve">Most professionals who use AI in their food business don't get results because their prompts are too vague. "Give me ideas for my menu" or "help me with marketing" produce generic answers that are no use to anyone.</w:t>
       </w:r>
     </w:p>
     <w:p>
@@ -2016,7 +2016,7 @@
           <w:sz w:val="22"/>
           <w:szCs w:val="22"/>
         </w:rPr>
-        <w:t xml:space="preserve">Put all of this into practice with the 80 prompts in the eBook at: aichef.pro</w:t>
+        <w:t xml:space="preserve">Put all of this into practice with the 300 prompts in the eBook at: aichef.pro</w:t>
       </w:r>
     </w:p>
     <w:p>

</xml_diff>